<commit_message>
Save Jessie's general CV and restructure its skills for readability
Her text verbatim. Skills now one category per line with duplicates removed.

Co-Authored-By: Claude Opus 5.5 <noreply@anthropic.com>
Claude-Session: https://claude.ai/code/session_01Qg3JRGKeFtCXXeV9rGpzwA
</commit_message>
<xml_diff>
--- a/dist/Jessie-Chan-CV-crypto-growth-general.docx
+++ b/dist/Jessie-Chan-CV-crypto-growth-general.docx
@@ -17,7 +17,7 @@
           <w:sz w:val="32"/>
           <w:szCs w:val="32"/>
         </w:rPr>
-        <w:t xml:space="preserve">JI CHENG (JESSIE) CHAN</w:t>
+        <w:t xml:space="preserve">JESSIE CHAN</w:t>
       </w:r>
     </w:p>
     <w:p>
@@ -52,7 +52,7 @@
           <w:sz w:val="20"/>
           <w:szCs w:val="20"/>
         </w:rPr>
-        <w:t xml:space="preserve">Crypto growth marketer with hands-on ownership of paid acquisition across five channels and 26 markets, plus the creative, app-store and reporting systems behind it. Experience spans retail, wealth and institutional products in a regulated environment, with a data-science research background. Works hands-on: finds the problem, builds the fix, and cuts what does not earn its budget.</w:t>
+        <w:t xml:space="preserve">Fintech/crypto growth marketer with hands-on ownership of paid acquisition across five channels and 26 markets, plus the creative, app-store and reporting systems behind it. I use AI to solve growth problems, most recently building an AI UGC workflow from scratch that cut CPI by 76% and increased acquisition volume by 15%. Experienced in managing retail, wealth and institutional products in a regulated environment, with a data-science research background.</w:t>
       </w:r>
     </w:p>
     <w:p>
@@ -92,7 +92,7 @@
           <w:sz w:val="20"/>
           <w:szCs w:val="20"/>
         </w:rPr>
-        <w:t xml:space="preserve">Blockchain.com, London, United Kingdom</w:t>
+        <w:t xml:space="preserve">Growth Marketing Intern</w:t>
       </w:r>
       <w:r>
         <w:rPr>
@@ -133,7 +133,7 @@
           <w:sz w:val="20"/>
           <w:szCs w:val="20"/>
         </w:rPr>
-        <w:t xml:space="preserve">Growth Marketing Intern  |  Retail, Wealth and Institutional</w:t>
+        <w:t xml:space="preserve">Blockchain.com, London, United Kingdom  |  Retail, Wealth and Institutional</w:t>
       </w:r>
     </w:p>
     <w:p>
@@ -155,7 +155,7 @@
           <w:sz w:val="20"/>
           <w:szCs w:val="20"/>
         </w:rPr>
-        <w:t xml:space="preserve">Scaled paid search from 187 to 562 daily installs (~3x) while holding CPI flat at ~$1.50, expanding from 2 to 26 countries, 9 to 121 live campaigns and 47 to 2,597 keywords; grew the core US campaign from 178 to 373 installs/day</w:t>
+        <w:t xml:space="preserve">Developed an AI-powered UGC production workflow, delivering 100+ video assets across TikTok and Google Ads, increasing CTR from 0.4% to 1.15% (+188%), reducing CPI from $25 to $6 (−76%), and cutting production time by 75%</w:t>
       </w:r>
     </w:p>
     <w:p>
@@ -177,7 +177,7 @@
           <w:sz w:val="20"/>
           <w:szCs w:val="20"/>
         </w:rPr>
-        <w:t xml:space="preserve">Ran 128 structured campaign tests across 26 markets, identifying 5 scalable campaign groups and cutting 26 underperforming campaigns; reallocating ~$21k of test spend reduced CPI on GB campaigns by 21.5% while installs rose 30.2%</w:t>
+        <w:t xml:space="preserve">Automated daily paid media channels reporting with Claude Code and Cursor, cutting 30 min/day of manual work, and partnered with Data Engineering and Security to publish it as an internal dashboard</w:t>
       </w:r>
     </w:p>
     <w:p>
@@ -199,7 +199,7 @@
           <w:sz w:val="20"/>
           <w:szCs w:val="20"/>
         </w:rPr>
-        <w:t xml:space="preserve">Led creative strategy and production across 9 channels, delivering 30+ briefs and 40 ads, plus 50+ assets to 3 external acquisition partners</w:t>
+        <w:t xml:space="preserve">Reduced CPI on UK campaigns by 21.5% while installs increased 30.2%, and scaled the core US campaign to 3x daily users acquired through CPP and SKAG testing and optimization</w:t>
       </w:r>
     </w:p>
     <w:p>
@@ -221,7 +221,7 @@
           <w:sz w:val="20"/>
           <w:szCs w:val="20"/>
         </w:rPr>
-        <w:t xml:space="preserve">Built an in-house AI UGC pipeline after evaluating 6 vendors, cutting production from ~2 hours to 30 minutes per asset and removing the team's dependence on creator-supplied assets</w:t>
+        <w:t xml:space="preserve">Built an outreach channel of 80 crypto publishers for high net worth client acquisition that sourced 3 major clients</w:t>
       </w:r>
     </w:p>
     <w:p>
@@ -243,7 +243,7 @@
           <w:sz w:val="20"/>
           <w:szCs w:val="20"/>
         </w:rPr>
-        <w:t xml:space="preserve">Automated daily Apple Search Ads reporting after evaluating 4 approaches, cutting ~30 min/day of manual work, and partnered with Data Engineering, AI Engineering and Security to publish it as an internal Streamlit dashboard</w:t>
+        <w:t xml:space="preserve">Supported Retail, Wealth and Institutional growth customer research and prospecting</w:t>
       </w:r>
     </w:p>
     <w:p>
@@ -265,7 +265,68 @@
           <w:sz w:val="20"/>
           <w:szCs w:val="20"/>
         </w:rPr>
-        <w:t xml:space="preserve">Owned app-store conversion across 20 storefronts and 20+ Custom Product Pages over 600+ keywords in 12 markets; shipped refreshed product pages with Front-End Engineering and reviewed regulated messaging across all retail products</w:t>
+        <w:t xml:space="preserve">Ran 128 structured campaign tests across 26 countries, identifying 5 scalable campaign groups and reallocating budget away from 26 underperforming campaigns</w:t>
+      </w:r>
+    </w:p>
+    <w:p>
+      <w:pPr>
+        <w:tabs>
+          <w:tab w:val="right" w:pos="10466"/>
+        </w:tabs>
+        <w:spacing w:after="10" w:before="100"/>
+      </w:pPr>
+      <w:r>
+        <w:rPr>
+          <w:rFonts w:ascii="Calibri" w:cs="Calibri" w:eastAsia="Calibri" w:hAnsi="Calibri"/>
+          <w:b/>
+          <w:bCs/>
+          <w:i w:val="false"/>
+          <w:iCs w:val="false"/>
+          <w:sz w:val="20"/>
+          <w:szCs w:val="20"/>
+        </w:rPr>
+        <w:t xml:space="preserve">Performance Marketer</w:t>
+      </w:r>
+      <w:r>
+        <w:rPr>
+          <w:rFonts w:ascii="Calibri" w:cs="Calibri" w:eastAsia="Calibri" w:hAnsi="Calibri"/>
+          <w:b w:val="false"/>
+          <w:bCs w:val="false"/>
+          <w:i w:val="false"/>
+          <w:iCs w:val="false"/>
+          <w:sz w:val="20"/>
+          <w:szCs w:val="20"/>
+        </w:rPr>
+        <w:t xml:space="preserve">	</w:t>
+      </w:r>
+      <w:r>
+        <w:rPr>
+          <w:rFonts w:ascii="Calibri" w:cs="Calibri" w:eastAsia="Calibri" w:hAnsi="Calibri"/>
+          <w:b/>
+          <w:bCs/>
+          <w:i w:val="false"/>
+          <w:iCs w:val="false"/>
+          <w:sz w:val="20"/>
+          <w:szCs w:val="20"/>
+        </w:rPr>
+        <w:t xml:space="preserve">Feb 2025 – Apr 2026</w:t>
+      </w:r>
+    </w:p>
+    <w:p>
+      <w:pPr>
+        <w:spacing w:after="60"/>
+      </w:pPr>
+      <w:r>
+        <w:rPr>
+          <w:rFonts w:ascii="Calibri" w:cs="Calibri" w:eastAsia="Calibri" w:hAnsi="Calibri"/>
+          <w:b w:val="false"/>
+          <w:bCs w:val="false"/>
+          <w:i/>
+          <w:iCs/>
+          <w:sz w:val="20"/>
+          <w:szCs w:val="20"/>
+        </w:rPr>
+        <w:t xml:space="preserve">Malaberg, London, United Kingdom</w:t>
       </w:r>
     </w:p>
     <w:p>
@@ -287,68 +348,7 @@
           <w:sz w:val="20"/>
           <w:szCs w:val="20"/>
         </w:rPr>
-        <w:t xml:space="preserve">Supported Wealth and Institutional growth with customer research and prospecting: a segmented survey returning 114 responses at a 14% response rate, an outreach list of 80 crypto publishers and a database of 100 iGaming operators</w:t>
-      </w:r>
-    </w:p>
-    <w:p>
-      <w:pPr>
-        <w:tabs>
-          <w:tab w:val="right" w:pos="10466"/>
-        </w:tabs>
-        <w:spacing w:after="10" w:before="100"/>
-      </w:pPr>
-      <w:r>
-        <w:rPr>
-          <w:rFonts w:ascii="Calibri" w:cs="Calibri" w:eastAsia="Calibri" w:hAnsi="Calibri"/>
-          <w:b/>
-          <w:bCs/>
-          <w:i w:val="false"/>
-          <w:iCs w:val="false"/>
-          <w:sz w:val="20"/>
-          <w:szCs w:val="20"/>
-        </w:rPr>
-        <w:t xml:space="preserve">Malaberg, London, United Kingdom</w:t>
-      </w:r>
-      <w:r>
-        <w:rPr>
-          <w:rFonts w:ascii="Calibri" w:cs="Calibri" w:eastAsia="Calibri" w:hAnsi="Calibri"/>
-          <w:b w:val="false"/>
-          <w:bCs w:val="false"/>
-          <w:i w:val="false"/>
-          <w:iCs w:val="false"/>
-          <w:sz w:val="20"/>
-          <w:szCs w:val="20"/>
-        </w:rPr>
-        <w:t xml:space="preserve">	</w:t>
-      </w:r>
-      <w:r>
-        <w:rPr>
-          <w:rFonts w:ascii="Calibri" w:cs="Calibri" w:eastAsia="Calibri" w:hAnsi="Calibri"/>
-          <w:b/>
-          <w:bCs/>
-          <w:i w:val="false"/>
-          <w:iCs w:val="false"/>
-          <w:sz w:val="20"/>
-          <w:szCs w:val="20"/>
-        </w:rPr>
-        <w:t xml:space="preserve">Feb 2025 – Apr 2026</w:t>
-      </w:r>
-    </w:p>
-    <w:p>
-      <w:pPr>
-        <w:spacing w:after="60"/>
-      </w:pPr>
-      <w:r>
-        <w:rPr>
-          <w:rFonts w:ascii="Calibri" w:cs="Calibri" w:eastAsia="Calibri" w:hAnsi="Calibri"/>
-          <w:b w:val="false"/>
-          <w:bCs w:val="false"/>
-          <w:i/>
-          <w:iCs/>
-          <w:sz w:val="20"/>
-          <w:szCs w:val="20"/>
-        </w:rPr>
-        <w:t xml:space="preserve">Performance Marketer</w:t>
+        <w:t xml:space="preserve">Managed £50k+ monthly paid budget managing ads and conversion funnels, sustaining 120% ROAS</w:t>
       </w:r>
     </w:p>
     <w:p>
@@ -370,7 +370,7 @@
           <w:sz w:val="20"/>
           <w:szCs w:val="20"/>
         </w:rPr>
-        <w:t xml:space="preserve">Managed £50k+ monthly paid budget, sustaining 120% ROAS</w:t>
+        <w:t xml:space="preserve">Increased daily conversions from 10 to 50+ (5x) by rebuilding landing and promotional pages in Figma and Photoshop, informed by funnel analysis in Power BI, Excel and Microsoft Clarity, contributing to +5% funnel progression</w:t>
       </w:r>
     </w:p>
     <w:p>
@@ -392,29 +392,7 @@
           <w:sz w:val="20"/>
           <w:szCs w:val="20"/>
         </w:rPr>
-        <w:t xml:space="preserve">Increased daily conversions from 10 to 50+ (5x) by rebuilding landing and promotional pages in Figma and Photoshop, informed by funnel analysis in Power BI, Excel and Microsoft Clarity; +5% funnel progression</w:t>
-      </w:r>
-    </w:p>
-    <w:p>
-      <w:pPr>
-        <w:pStyle w:val="ListParagraph"/>
-        <w:numPr>
-          <w:ilvl w:val="0"/>
-          <w:numId w:val="2"/>
-        </w:numPr>
-        <w:spacing w:after="50"/>
-      </w:pPr>
-      <w:r>
-        <w:rPr>
-          <w:rFonts w:ascii="Calibri" w:cs="Calibri" w:eastAsia="Calibri" w:hAnsi="Calibri"/>
-          <w:b w:val="false"/>
-          <w:bCs w:val="false"/>
-          <w:i w:val="false"/>
-          <w:iCs w:val="false"/>
-          <w:sz w:val="20"/>
-          <w:szCs w:val="20"/>
-        </w:rPr>
-        <w:t xml:space="preserve">Built a company-wide automated reporting pipeline on lead conversion, cutting daily report preparation from 30+ min to almost immediate output; led weekly Compliance reviews to ship regulated consumer-finance messaging</w:t>
+        <w:t xml:space="preserve">Built a company-wide automated reporting pipeline on lead conversion, cutting daily report preparation from 30+ min to almost immediate output</w:t>
       </w:r>
     </w:p>
     <w:p>
@@ -576,6 +554,64 @@
           <w:sz w:val="20"/>
           <w:szCs w:val="20"/>
         </w:rPr>
+        <w:t xml:space="preserve">AI &amp; automation: </w:t>
+      </w:r>
+      <w:r>
+        <w:rPr>
+          <w:rFonts w:ascii="Calibri" w:cs="Calibri" w:eastAsia="Calibri" w:hAnsi="Calibri"/>
+          <w:b w:val="false"/>
+          <w:bCs w:val="false"/>
+          <w:i w:val="false"/>
+          <w:iCs w:val="false"/>
+          <w:sz w:val="20"/>
+          <w:szCs w:val="20"/>
+        </w:rPr>
+        <w:t xml:space="preserve">Claude Code, Cursor, MCP and API integrations (Windsor.ai), AI UGC workflows (avatar, voice, motion, video), vibe-coded apps and bots (fly.io)</w:t>
+      </w:r>
+    </w:p>
+    <w:p>
+      <w:pPr>
+        <w:spacing w:after="60"/>
+      </w:pPr>
+      <w:r>
+        <w:rPr>
+          <w:rFonts w:ascii="Calibri" w:cs="Calibri" w:eastAsia="Calibri" w:hAnsi="Calibri"/>
+          <w:b/>
+          <w:bCs/>
+          <w:i w:val="false"/>
+          <w:iCs w:val="false"/>
+          <w:sz w:val="20"/>
+          <w:szCs w:val="20"/>
+        </w:rPr>
+        <w:t xml:space="preserve">AI creative tools: </w:t>
+      </w:r>
+      <w:r>
+        <w:rPr>
+          <w:rFonts w:ascii="Calibri" w:cs="Calibri" w:eastAsia="Calibri" w:hAnsi="Calibri"/>
+          <w:b w:val="false"/>
+          <w:bCs w:val="false"/>
+          <w:i w:val="false"/>
+          <w:iCs w:val="false"/>
+          <w:sz w:val="20"/>
+          <w:szCs w:val="20"/>
+        </w:rPr>
+        <w:t xml:space="preserve">Runway, Jitter, Gemini, Seedance, Wan, Seeaudio, ElevenLabs</w:t>
+      </w:r>
+    </w:p>
+    <w:p>
+      <w:pPr>
+        <w:spacing w:after="60"/>
+      </w:pPr>
+      <w:r>
+        <w:rPr>
+          <w:rFonts w:ascii="Calibri" w:cs="Calibri" w:eastAsia="Calibri" w:hAnsi="Calibri"/>
+          <w:b/>
+          <w:bCs/>
+          <w:i w:val="false"/>
+          <w:iCs w:val="false"/>
+          <w:sz w:val="20"/>
+          <w:szCs w:val="20"/>
+        </w:rPr>
         <w:t xml:space="preserve">Paid media: </w:t>
       </w:r>
       <w:r>
@@ -588,7 +624,7 @@
           <w:sz w:val="20"/>
           <w:szCs w:val="20"/>
         </w:rPr>
-        <w:t xml:space="preserve">Apple Search Ads, Google Ads, Meta, TikTok, LinkedIn; ASO and Custom Product Pages; international campaign structure; creative testing and budget allocation</w:t>
+        <w:t xml:space="preserve">Apple Search Ads, Google Ads, Meta, TikTok, LinkedIn, ASO and Custom Product Pages, creative testing, budget allocation</w:t>
       </w:r>
     </w:p>
     <w:p>
@@ -605,19 +641,19 @@
           <w:sz w:val="20"/>
           <w:szCs w:val="20"/>
         </w:rPr>
-        <w:t xml:space="preserve">Tracking &amp; measurement: </w:t>
-      </w:r>
-      <w:r>
-        <w:rPr>
-          <w:rFonts w:ascii="Calibri" w:cs="Calibri" w:eastAsia="Calibri" w:hAnsi="Calibri"/>
-          <w:b w:val="false"/>
-          <w:bCs w:val="false"/>
-          <w:i w:val="false"/>
-          <w:iCs w:val="false"/>
-          <w:sz w:val="20"/>
-          <w:szCs w:val="20"/>
-        </w:rPr>
-        <w:t xml:space="preserve">Ad-account, conversion-tracking and campaign-structure setup; Apple Search Ads attribution; funnel and cohort analysis; experimental test design; survey design and segmentation; Power BI, Excel, Microsoft Clarity, Streamlit, R, Python, SQL</w:t>
+        <w:t xml:space="preserve">Creative: </w:t>
+      </w:r>
+      <w:r>
+        <w:rPr>
+          <w:rFonts w:ascii="Calibri" w:cs="Calibri" w:eastAsia="Calibri" w:hAnsi="Calibri"/>
+          <w:b w:val="false"/>
+          <w:bCs w:val="false"/>
+          <w:i w:val="false"/>
+          <w:iCs w:val="false"/>
+          <w:sz w:val="20"/>
+          <w:szCs w:val="20"/>
+        </w:rPr>
+        <w:t xml:space="preserve">Creative briefing and direction, agency and partner management, Figma, Photoshop</w:t>
       </w:r>
     </w:p>
     <w:p>
@@ -634,19 +670,19 @@
           <w:sz w:val="20"/>
           <w:szCs w:val="20"/>
         </w:rPr>
-        <w:t xml:space="preserve">Creative: </w:t>
-      </w:r>
-      <w:r>
-        <w:rPr>
-          <w:rFonts w:ascii="Calibri" w:cs="Calibri" w:eastAsia="Calibri" w:hAnsi="Calibri"/>
-          <w:b w:val="false"/>
-          <w:bCs w:val="false"/>
-          <w:i w:val="false"/>
-          <w:iCs w:val="false"/>
-          <w:sz w:val="20"/>
-          <w:szCs w:val="20"/>
-        </w:rPr>
-        <w:t xml:space="preserve">Creative briefing and direction, AI UGC production (avatar, voice, motion, video), agency and partner management, Figma, Photoshop</w:t>
+        <w:t xml:space="preserve">Measurement: </w:t>
+      </w:r>
+      <w:r>
+        <w:rPr>
+          <w:rFonts w:ascii="Calibri" w:cs="Calibri" w:eastAsia="Calibri" w:hAnsi="Calibri"/>
+          <w:b w:val="false"/>
+          <w:bCs w:val="false"/>
+          <w:i w:val="false"/>
+          <w:iCs w:val="false"/>
+          <w:sz w:val="20"/>
+          <w:szCs w:val="20"/>
+        </w:rPr>
+        <w:t xml:space="preserve">AppsFlyer, Apple Search Ads attribution, conversion tracking setup, funnel and cohort analysis, test and survey design, competitor research (Appfollow), Power BI, Excel, Microsoft Clarity, SQL, Python, R</w:t>
       </w:r>
     </w:p>
     <w:p>
@@ -676,6 +712,35 @@
           <w:szCs w:val="20"/>
         </w:rPr>
         <w:t xml:space="preserve">English, Mandarin, Cantonese (native), Malay (fluent)</w:t>
+      </w:r>
+    </w:p>
+    <w:p>
+      <w:pPr>
+        <w:spacing w:after="60"/>
+      </w:pPr>
+      <w:r>
+        <w:rPr>
+          <w:rFonts w:ascii="Calibri" w:cs="Calibri" w:eastAsia="Calibri" w:hAnsi="Calibri"/>
+          <w:b/>
+          <w:bCs/>
+          <w:i w:val="false"/>
+          <w:iCs w:val="false"/>
+          <w:sz w:val="20"/>
+          <w:szCs w:val="20"/>
+        </w:rPr>
+        <w:t xml:space="preserve">Interests: </w:t>
+      </w:r>
+      <w:r>
+        <w:rPr>
+          <w:rFonts w:ascii="Calibri" w:cs="Calibri" w:eastAsia="Calibri" w:hAnsi="Calibri"/>
+          <w:b w:val="false"/>
+          <w:bCs w:val="false"/>
+          <w:i w:val="false"/>
+          <w:iCs w:val="false"/>
+          <w:sz w:val="20"/>
+          <w:szCs w:val="20"/>
+        </w:rPr>
+        <w:t xml:space="preserve">Digital assets, business psychology, languages, martial arts, weightlifting</w:t>
       </w:r>
     </w:p>
     <w:sectPr>

</xml_diff>

<commit_message>
Lead general CV skills with AI UGC production and its tools
Co-Authored-By: Claude Opus 5.5 <noreply@anthropic.com>
Claude-Session: https://claude.ai/code/session_01Qg3JRGKeFtCXXeV9rGpzwA
</commit_message>
<xml_diff>
--- a/dist/Jessie-Chan-CV-crypto-growth-general.docx
+++ b/dist/Jessie-Chan-CV-crypto-growth-general.docx
@@ -554,6 +554,35 @@
           <w:sz w:val="20"/>
           <w:szCs w:val="20"/>
         </w:rPr>
+        <w:t xml:space="preserve">AI UGC production: </w:t>
+      </w:r>
+      <w:r>
+        <w:rPr>
+          <w:rFonts w:ascii="Calibri" w:cs="Calibri" w:eastAsia="Calibri" w:hAnsi="Calibri"/>
+          <w:b w:val="false"/>
+          <w:bCs w:val="false"/>
+          <w:i w:val="false"/>
+          <w:iCs w:val="false"/>
+          <w:sz w:val="20"/>
+          <w:szCs w:val="20"/>
+        </w:rPr>
+        <w:t xml:space="preserve">End-to-end workflow design (avatar, voice, motion, video) with Runway, Jitter, Gemini, Seedance, Wan, Seeaudio, ElevenLabs</w:t>
+      </w:r>
+    </w:p>
+    <w:p>
+      <w:pPr>
+        <w:spacing w:after="60"/>
+      </w:pPr>
+      <w:r>
+        <w:rPr>
+          <w:rFonts w:ascii="Calibri" w:cs="Calibri" w:eastAsia="Calibri" w:hAnsi="Calibri"/>
+          <w:b/>
+          <w:bCs/>
+          <w:i w:val="false"/>
+          <w:iCs w:val="false"/>
+          <w:sz w:val="20"/>
+          <w:szCs w:val="20"/>
+        </w:rPr>
         <w:t xml:space="preserve">AI &amp; automation: </w:t>
       </w:r>
       <w:r>
@@ -566,36 +595,7 @@
           <w:sz w:val="20"/>
           <w:szCs w:val="20"/>
         </w:rPr>
-        <w:t xml:space="preserve">Claude Code, Cursor, MCP and API integrations (Windsor.ai), AI UGC workflows (avatar, voice, motion, video), vibe-coded apps and bots (fly.io)</w:t>
-      </w:r>
-    </w:p>
-    <w:p>
-      <w:pPr>
-        <w:spacing w:after="60"/>
-      </w:pPr>
-      <w:r>
-        <w:rPr>
-          <w:rFonts w:ascii="Calibri" w:cs="Calibri" w:eastAsia="Calibri" w:hAnsi="Calibri"/>
-          <w:b/>
-          <w:bCs/>
-          <w:i w:val="false"/>
-          <w:iCs w:val="false"/>
-          <w:sz w:val="20"/>
-          <w:szCs w:val="20"/>
-        </w:rPr>
-        <w:t xml:space="preserve">AI creative tools: </w:t>
-      </w:r>
-      <w:r>
-        <w:rPr>
-          <w:rFonts w:ascii="Calibri" w:cs="Calibri" w:eastAsia="Calibri" w:hAnsi="Calibri"/>
-          <w:b w:val="false"/>
-          <w:bCs w:val="false"/>
-          <w:i w:val="false"/>
-          <w:iCs w:val="false"/>
-          <w:sz w:val="20"/>
-          <w:szCs w:val="20"/>
-        </w:rPr>
-        <w:t xml:space="preserve">Runway, Jitter, Gemini, Seedance, Wan, Seeaudio, ElevenLabs</w:t>
+        <w:t xml:space="preserve">Claude Code, Cursor, MCP and API integrations (Windsor.ai), vibe-coded apps and bots (fly.io)</w:t>
       </w:r>
     </w:p>
     <w:p>

</xml_diff>